<commit_message>
populate peppers doc with real images from DuckDuckGo
- DDG image search via vqd-token flow; fetches Bing CDN thumbnail
  (always reachable) instead of original-host URLs.
- Pillow re-encode pass to add DPI metadata so python-docx
  add_picture doesn't divide by zero on web JPEGs/WebPs.
- Filter out shutterstock/dreamstime/etc. so output has no stock
  watermarks.
- Hebrew run sizing now sets w:sz + w:szCs so 36pt actually applies
  to complex script.
- Regenerated docs/peppers-2026.docx (real photos for all 19
  varieties) and converted to docs/peppers-2026.pdf via libreoffice.

https://claude.ai/code/session_01F5sStxgq1EVBAbHf6eXV38
</commit_message>
<xml_diff>
--- a/docs/peppers-2026.docx
+++ b/docs/peppers-2026.docx
@@ -12,6 +12,8 @@
           <w:b/>
           <w:color w:val="C93030"/>
           <w:sz w:val="112"/>
+          <w:szCs w:val="112"/>
+          <w:bCs w:val="1"/>
           <w:rtl w:val="1"/>
         </w:rPr>
         <w:t>זני פלפלים חריפים</w:t>
@@ -40,6 +42,7 @@
         <w:rPr>
           <w:color w:val="808090"/>
           <w:sz w:val="28"/>
+          <w:szCs w:val="28"/>
           <w:rtl w:val="1"/>
         </w:rPr>
         <w:t>19 זנים — שמות עבריים, אנגליים ותמונות</w:t>
@@ -94,6 +97,8 @@
                 <w:b/>
                 <w:color w:val="101018"/>
                 <w:sz w:val="72"/>
+                <w:szCs w:val="72"/>
+                <w:bCs w:val="1"/>
                 <w:rtl w:val="1"/>
               </w:rPr>
               <w:t>אנברו צהוב</w:t>
@@ -138,19 +143,6 @@
               <w:t>100K–350K SHU</w:t>
             </w:r>
           </w:p>
-          <w:p>
-            <w:pPr>
-              <w:spacing w:before="400"/>
-              <w:jc w:val="right"/>
-            </w:pPr>
-            <w:r>
-              <w:rPr>
-                <w:color w:val="C93030"/>
-                <w:sz w:val="18"/>
-              </w:rPr>
-              <w:t>תמונה לא נטענה — ראה: https://en.wikipedia.org/wiki/Habanero</w:t>
-            </w:r>
-          </w:p>
         </w:tc>
         <w:tc>
           <w:tcPr>
@@ -179,7 +171,7 @@
                     <a:graphicData uri="http://schemas.openxmlformats.org/drawingml/2006/picture">
                       <pic:pic>
                         <pic:nvPicPr>
-                          <pic:cNvPr id="0" name="image.png"/>
+                          <pic:cNvPr id="0" name="image.jpg"/>
                           <pic:cNvPicPr/>
                         </pic:nvPicPr>
                         <pic:blipFill>
@@ -254,6 +246,8 @@
                 <w:b/>
                 <w:color w:val="101018"/>
                 <w:sz w:val="72"/>
+                <w:szCs w:val="72"/>
+                <w:bCs w:val="1"/>
                 <w:rtl w:val="1"/>
               </w:rPr>
               <w:t>אנברו אדום</w:t>
@@ -298,19 +292,6 @@
               <w:t>100K–350K SHU</w:t>
             </w:r>
           </w:p>
-          <w:p>
-            <w:pPr>
-              <w:spacing w:before="400"/>
-              <w:jc w:val="right"/>
-            </w:pPr>
-            <w:r>
-              <w:rPr>
-                <w:color w:val="C93030"/>
-                <w:sz w:val="18"/>
-              </w:rPr>
-              <w:t>תמונה לא נטענה — ראה: https://en.wikipedia.org/wiki/Habanero</w:t>
-            </w:r>
-          </w:p>
         </w:tc>
         <w:tc>
           <w:tcPr>
@@ -330,7 +311,7 @@
             <w:r>
               <w:drawing>
                 <wp:inline xmlns:a="http://schemas.openxmlformats.org/drawingml/2006/main" xmlns:pic="http://schemas.openxmlformats.org/drawingml/2006/picture">
-                  <wp:extent cx="4320000" cy="4320000"/>
+                  <wp:extent cx="4320000" cy="6480000"/>
                   <wp:docPr id="2" name="Picture 2"/>
                   <wp:cNvGraphicFramePr>
                     <a:graphicFrameLocks noChangeAspect="1"/>
@@ -339,7 +320,7 @@
                     <a:graphicData uri="http://schemas.openxmlformats.org/drawingml/2006/picture">
                       <pic:pic>
                         <pic:nvPicPr>
-                          <pic:cNvPr id="0" name="image.png"/>
+                          <pic:cNvPr id="0" name="image.jpg"/>
                           <pic:cNvPicPr/>
                         </pic:nvPicPr>
                         <pic:blipFill>
@@ -351,7 +332,7 @@
                         <pic:spPr>
                           <a:xfrm>
                             <a:off x="0" y="0"/>
-                            <a:ext cx="4320000" cy="4320000"/>
+                            <a:ext cx="4320000" cy="6480000"/>
                           </a:xfrm>
                           <a:prstGeom prst="rect"/>
                         </pic:spPr>
@@ -414,6 +395,8 @@
                 <w:b/>
                 <w:color w:val="101018"/>
                 <w:sz w:val="72"/>
+                <w:szCs w:val="72"/>
+                <w:bCs w:val="1"/>
                 <w:rtl w:val="1"/>
               </w:rPr>
               <w:t>קרולינה ריפר אדום</w:t>
@@ -458,19 +441,6 @@
               <w:t>~1.6M–2.2M SHU</w:t>
             </w:r>
           </w:p>
-          <w:p>
-            <w:pPr>
-              <w:spacing w:before="400"/>
-              <w:jc w:val="right"/>
-            </w:pPr>
-            <w:r>
-              <w:rPr>
-                <w:color w:val="C93030"/>
-                <w:sz w:val="18"/>
-              </w:rPr>
-              <w:t>תמונה לא נטענה — ראה: https://en.wikipedia.org/wiki/Carolina_Reaper</w:t>
-            </w:r>
-          </w:p>
         </w:tc>
         <w:tc>
           <w:tcPr>
@@ -490,7 +460,7 @@
             <w:r>
               <w:drawing>
                 <wp:inline xmlns:a="http://schemas.openxmlformats.org/drawingml/2006/main" xmlns:pic="http://schemas.openxmlformats.org/drawingml/2006/picture">
-                  <wp:extent cx="4320000" cy="4320000"/>
+                  <wp:extent cx="4320000" cy="2870886"/>
                   <wp:docPr id="3" name="Picture 3"/>
                   <wp:cNvGraphicFramePr>
                     <a:graphicFrameLocks noChangeAspect="1"/>
@@ -499,11 +469,11 @@
                     <a:graphicData uri="http://schemas.openxmlformats.org/drawingml/2006/picture">
                       <pic:pic>
                         <pic:nvPicPr>
-                          <pic:cNvPr id="0" name="image.png"/>
+                          <pic:cNvPr id="0" name="image.jpg"/>
                           <pic:cNvPicPr/>
                         </pic:nvPicPr>
                         <pic:blipFill>
-                          <a:blip r:embed="rId10"/>
+                          <a:blip r:embed="rId11"/>
                           <a:stretch>
                             <a:fillRect/>
                           </a:stretch>
@@ -511,7 +481,7 @@
                         <pic:spPr>
                           <a:xfrm>
                             <a:off x="0" y="0"/>
-                            <a:ext cx="4320000" cy="4320000"/>
+                            <a:ext cx="4320000" cy="2870886"/>
                           </a:xfrm>
                           <a:prstGeom prst="rect"/>
                         </pic:spPr>
@@ -574,6 +544,8 @@
                 <w:b/>
                 <w:color w:val="101018"/>
                 <w:sz w:val="72"/>
+                <w:szCs w:val="72"/>
+                <w:bCs w:val="1"/>
                 <w:rtl w:val="1"/>
               </w:rPr>
               <w:t>אנברו שוקולד</w:t>
@@ -618,19 +590,6 @@
               <w:t>300K–425K SHU</w:t>
             </w:r>
           </w:p>
-          <w:p>
-            <w:pPr>
-              <w:spacing w:before="400"/>
-              <w:jc w:val="right"/>
-            </w:pPr>
-            <w:r>
-              <w:rPr>
-                <w:color w:val="C93030"/>
-                <w:sz w:val="18"/>
-              </w:rPr>
-              <w:t>תמונה לא נטענה — ראה: https://en.wikipedia.org/wiki/Habanero</w:t>
-            </w:r>
-          </w:p>
         </w:tc>
         <w:tc>
           <w:tcPr>
@@ -659,11 +618,11 @@
                     <a:graphicData uri="http://schemas.openxmlformats.org/drawingml/2006/picture">
                       <pic:pic>
                         <pic:nvPicPr>
-                          <pic:cNvPr id="0" name="image.png"/>
+                          <pic:cNvPr id="0" name="image.jpg"/>
                           <pic:cNvPicPr/>
                         </pic:nvPicPr>
                         <pic:blipFill>
-                          <a:blip r:embed="rId11"/>
+                          <a:blip r:embed="rId12"/>
                           <a:stretch>
                             <a:fillRect/>
                           </a:stretch>
@@ -734,6 +693,8 @@
                 <w:b/>
                 <w:color w:val="101018"/>
                 <w:sz w:val="72"/>
+                <w:szCs w:val="72"/>
+                <w:bCs w:val="1"/>
                 <w:rtl w:val="1"/>
               </w:rPr>
               <w:t>פטליי (כתום אפריקאי)</w:t>
@@ -778,19 +739,6 @@
               <w:t>125K–400K SHU</w:t>
             </w:r>
           </w:p>
-          <w:p>
-            <w:pPr>
-              <w:spacing w:before="400"/>
-              <w:jc w:val="right"/>
-            </w:pPr>
-            <w:r>
-              <w:rPr>
-                <w:color w:val="C93030"/>
-                <w:sz w:val="18"/>
-              </w:rPr>
-              <w:t>תמונה לא נטענה — ראה: https://en.wikipedia.org/wiki/Fatalii</w:t>
-            </w:r>
-          </w:p>
         </w:tc>
         <w:tc>
           <w:tcPr>
@@ -810,7 +758,7 @@
             <w:r>
               <w:drawing>
                 <wp:inline xmlns:a="http://schemas.openxmlformats.org/drawingml/2006/main" xmlns:pic="http://schemas.openxmlformats.org/drawingml/2006/picture">
-                  <wp:extent cx="4320000" cy="4320000"/>
+                  <wp:extent cx="4320000" cy="2880000"/>
                   <wp:docPr id="5" name="Picture 5"/>
                   <wp:cNvGraphicFramePr>
                     <a:graphicFrameLocks noChangeAspect="1"/>
@@ -819,11 +767,11 @@
                     <a:graphicData uri="http://schemas.openxmlformats.org/drawingml/2006/picture">
                       <pic:pic>
                         <pic:nvPicPr>
-                          <pic:cNvPr id="0" name="image.png"/>
+                          <pic:cNvPr id="0" name="image.jpg"/>
                           <pic:cNvPicPr/>
                         </pic:nvPicPr>
                         <pic:blipFill>
-                          <a:blip r:embed="rId9"/>
+                          <a:blip r:embed="rId13"/>
                           <a:stretch>
                             <a:fillRect/>
                           </a:stretch>
@@ -831,7 +779,7 @@
                         <pic:spPr>
                           <a:xfrm>
                             <a:off x="0" y="0"/>
-                            <a:ext cx="4320000" cy="4320000"/>
+                            <a:ext cx="4320000" cy="2880000"/>
                           </a:xfrm>
                           <a:prstGeom prst="rect"/>
                         </pic:spPr>
@@ -894,6 +842,8 @@
                 <w:b/>
                 <w:color w:val="101018"/>
                 <w:sz w:val="72"/>
+                <w:szCs w:val="72"/>
+                <w:bCs w:val="1"/>
                 <w:rtl w:val="1"/>
               </w:rPr>
               <w:t>אנברו סגול מקומט</w:t>
@@ -938,19 +888,6 @@
               <w:t>100K–350K SHU</w:t>
             </w:r>
           </w:p>
-          <w:p>
-            <w:pPr>
-              <w:spacing w:before="400"/>
-              <w:jc w:val="right"/>
-            </w:pPr>
-            <w:r>
-              <w:rPr>
-                <w:color w:val="C93030"/>
-                <w:sz w:val="18"/>
-              </w:rPr>
-              <w:t>תמונה לא נטענה — ראה: https://en.wikipedia.org/wiki/Habanero</w:t>
-            </w:r>
-          </w:p>
         </w:tc>
         <w:tc>
           <w:tcPr>
@@ -970,7 +907,7 @@
             <w:r>
               <w:drawing>
                 <wp:inline xmlns:a="http://schemas.openxmlformats.org/drawingml/2006/main" xmlns:pic="http://schemas.openxmlformats.org/drawingml/2006/picture">
-                  <wp:extent cx="4320000" cy="4320000"/>
+                  <wp:extent cx="4320000" cy="3235443"/>
                   <wp:docPr id="6" name="Picture 6"/>
                   <wp:cNvGraphicFramePr>
                     <a:graphicFrameLocks noChangeAspect="1"/>
@@ -979,11 +916,11 @@
                     <a:graphicData uri="http://schemas.openxmlformats.org/drawingml/2006/picture">
                       <pic:pic>
                         <pic:nvPicPr>
-                          <pic:cNvPr id="0" name="image.png"/>
+                          <pic:cNvPr id="0" name="image.jpg"/>
                           <pic:cNvPicPr/>
                         </pic:nvPicPr>
                         <pic:blipFill>
-                          <a:blip r:embed="rId12"/>
+                          <a:blip r:embed="rId14"/>
                           <a:stretch>
                             <a:fillRect/>
                           </a:stretch>
@@ -991,7 +928,7 @@
                         <pic:spPr>
                           <a:xfrm>
                             <a:off x="0" y="0"/>
-                            <a:ext cx="4320000" cy="4320000"/>
+                            <a:ext cx="4320000" cy="3235443"/>
                           </a:xfrm>
                           <a:prstGeom prst="rect"/>
                         </pic:spPr>
@@ -1054,6 +991,8 @@
                 <w:b/>
                 <w:color w:val="101018"/>
                 <w:sz w:val="72"/>
+                <w:szCs w:val="72"/>
+                <w:bCs w:val="1"/>
                 <w:rtl w:val="1"/>
               </w:rPr>
               <w:t>קרולינה ריפר צהוב</w:t>
@@ -1098,19 +1037,6 @@
               <w:t>~1.4M–2M SHU</w:t>
             </w:r>
           </w:p>
-          <w:p>
-            <w:pPr>
-              <w:spacing w:before="400"/>
-              <w:jc w:val="right"/>
-            </w:pPr>
-            <w:r>
-              <w:rPr>
-                <w:color w:val="C93030"/>
-                <w:sz w:val="18"/>
-              </w:rPr>
-              <w:t>תמונה לא נטענה — ראה: https://en.wikipedia.org/wiki/Carolina_Reaper</w:t>
-            </w:r>
-          </w:p>
         </w:tc>
         <w:tc>
           <w:tcPr>
@@ -1139,11 +1065,11 @@
                     <a:graphicData uri="http://schemas.openxmlformats.org/drawingml/2006/picture">
                       <pic:pic>
                         <pic:nvPicPr>
-                          <pic:cNvPr id="0" name="image.png"/>
+                          <pic:cNvPr id="0" name="image.jpg"/>
                           <pic:cNvPicPr/>
                         </pic:nvPicPr>
                         <pic:blipFill>
-                          <a:blip r:embed="rId9"/>
+                          <a:blip r:embed="rId15"/>
                           <a:stretch>
                             <a:fillRect/>
                           </a:stretch>
@@ -1214,6 +1140,8 @@
                 <w:b/>
                 <w:color w:val="101018"/>
                 <w:sz w:val="72"/>
+                <w:szCs w:val="72"/>
+                <w:bCs w:val="1"/>
                 <w:rtl w:val="1"/>
               </w:rPr>
               <w:t>קרולינה ריפר שוקולד</w:t>
@@ -1258,19 +1186,6 @@
               <w:t>~1.5M–2M SHU</w:t>
             </w:r>
           </w:p>
-          <w:p>
-            <w:pPr>
-              <w:spacing w:before="400"/>
-              <w:jc w:val="right"/>
-            </w:pPr>
-            <w:r>
-              <w:rPr>
-                <w:color w:val="C93030"/>
-                <w:sz w:val="18"/>
-              </w:rPr>
-              <w:t>תמונה לא נטענה — ראה: https://en.wikipedia.org/wiki/Carolina_Reaper</w:t>
-            </w:r>
-          </w:p>
         </w:tc>
         <w:tc>
           <w:tcPr>
@@ -1299,11 +1214,11 @@
                     <a:graphicData uri="http://schemas.openxmlformats.org/drawingml/2006/picture">
                       <pic:pic>
                         <pic:nvPicPr>
-                          <pic:cNvPr id="0" name="image.png"/>
+                          <pic:cNvPr id="0" name="image.jpg"/>
                           <pic:cNvPicPr/>
                         </pic:nvPicPr>
                         <pic:blipFill>
-                          <a:blip r:embed="rId11"/>
+                          <a:blip r:embed="rId16"/>
                           <a:stretch>
                             <a:fillRect/>
                           </a:stretch>
@@ -1374,6 +1289,8 @@
                 <w:b/>
                 <w:color w:val="101018"/>
                 <w:sz w:val="72"/>
+                <w:szCs w:val="72"/>
+                <w:bCs w:val="1"/>
                 <w:rtl w:val="1"/>
               </w:rPr>
               <w:t>גוליקה בהוט צהוב</w:t>
@@ -1418,19 +1335,6 @@
               <w:t>~800K–1M SHU</w:t>
             </w:r>
           </w:p>
-          <w:p>
-            <w:pPr>
-              <w:spacing w:before="400"/>
-              <w:jc w:val="right"/>
-            </w:pPr>
-            <w:r>
-              <w:rPr>
-                <w:color w:val="C93030"/>
-                <w:sz w:val="18"/>
-              </w:rPr>
-              <w:t>תמונה לא נטענה — ראה: https://en.wikipedia.org/wiki/Bhut_jolokia</w:t>
-            </w:r>
-          </w:p>
         </w:tc>
         <w:tc>
           <w:tcPr>
@@ -1459,11 +1363,11 @@
                     <a:graphicData uri="http://schemas.openxmlformats.org/drawingml/2006/picture">
                       <pic:pic>
                         <pic:nvPicPr>
-                          <pic:cNvPr id="0" name="image.png"/>
+                          <pic:cNvPr id="0" name="image.jpg"/>
                           <pic:cNvPicPr/>
                         </pic:nvPicPr>
                         <pic:blipFill>
-                          <a:blip r:embed="rId9"/>
+                          <a:blip r:embed="rId17"/>
                           <a:stretch>
                             <a:fillRect/>
                           </a:stretch>
@@ -1534,6 +1438,8 @@
                 <w:b/>
                 <w:color w:val="101018"/>
                 <w:sz w:val="72"/>
+                <w:szCs w:val="72"/>
+                <w:bCs w:val="1"/>
                 <w:rtl w:val="1"/>
               </w:rPr>
               <w:t>סקורפיו ריפר אדום</w:t>
@@ -1578,19 +1484,6 @@
               <w:t>~1.2M–2M SHU</w:t>
             </w:r>
           </w:p>
-          <w:p>
-            <w:pPr>
-              <w:spacing w:before="400"/>
-              <w:jc w:val="right"/>
-            </w:pPr>
-            <w:r>
-              <w:rPr>
-                <w:color w:val="C93030"/>
-                <w:sz w:val="18"/>
-              </w:rPr>
-              <w:t>תמונה לא נטענה — ראה: https://en.wikipedia.org/wiki/Trinidad_Scorpion_pepper</w:t>
-            </w:r>
-          </w:p>
         </w:tc>
         <w:tc>
           <w:tcPr>
@@ -1619,11 +1512,11 @@
                     <a:graphicData uri="http://schemas.openxmlformats.org/drawingml/2006/picture">
                       <pic:pic>
                         <pic:nvPicPr>
-                          <pic:cNvPr id="0" name="image.png"/>
+                          <pic:cNvPr id="0" name="image.jpg"/>
                           <pic:cNvPicPr/>
                         </pic:nvPicPr>
                         <pic:blipFill>
-                          <a:blip r:embed="rId10"/>
+                          <a:blip r:embed="rId18"/>
                           <a:stretch>
                             <a:fillRect/>
                           </a:stretch>
@@ -1694,6 +1587,8 @@
                 <w:b/>
                 <w:color w:val="101018"/>
                 <w:sz w:val="72"/>
+                <w:szCs w:val="72"/>
+                <w:bCs w:val="1"/>
                 <w:rtl w:val="1"/>
               </w:rPr>
               <w:t>צ׳רי בומב אדום</w:t>
@@ -1738,19 +1633,6 @@
               <w:t>2.5K–5K SHU</w:t>
             </w:r>
           </w:p>
-          <w:p>
-            <w:pPr>
-              <w:spacing w:before="400"/>
-              <w:jc w:val="right"/>
-            </w:pPr>
-            <w:r>
-              <w:rPr>
-                <w:color w:val="C93030"/>
-                <w:sz w:val="18"/>
-              </w:rPr>
-              <w:t>תמונה לא נטענה — ראה: https://en.wikipedia.org/wiki/Cherry_pepper</w:t>
-            </w:r>
-          </w:p>
         </w:tc>
         <w:tc>
           <w:tcPr>
@@ -1779,11 +1661,11 @@
                     <a:graphicData uri="http://schemas.openxmlformats.org/drawingml/2006/picture">
                       <pic:pic>
                         <pic:nvPicPr>
-                          <pic:cNvPr id="0" name="image.png"/>
+                          <pic:cNvPr id="0" name="image.jpg"/>
                           <pic:cNvPicPr/>
                         </pic:nvPicPr>
                         <pic:blipFill>
-                          <a:blip r:embed="rId10"/>
+                          <a:blip r:embed="rId19"/>
                           <a:stretch>
                             <a:fillRect/>
                           </a:stretch>
@@ -1854,6 +1736,8 @@
                 <w:b/>
                 <w:color w:val="101018"/>
                 <w:sz w:val="72"/>
+                <w:szCs w:val="72"/>
+                <w:bCs w:val="1"/>
                 <w:rtl w:val="1"/>
               </w:rPr>
               <w:t>גוליקה בהוט סגול</w:t>
@@ -1898,19 +1782,6 @@
               <w:t>~800K–1M SHU</w:t>
             </w:r>
           </w:p>
-          <w:p>
-            <w:pPr>
-              <w:spacing w:before="400"/>
-              <w:jc w:val="right"/>
-            </w:pPr>
-            <w:r>
-              <w:rPr>
-                <w:color w:val="C93030"/>
-                <w:sz w:val="18"/>
-              </w:rPr>
-              <w:t>תמונה לא נטענה — ראה: https://en.wikipedia.org/wiki/Bhut_jolokia</w:t>
-            </w:r>
-          </w:p>
         </w:tc>
         <w:tc>
           <w:tcPr>
@@ -1930,7 +1801,7 @@
             <w:r>
               <w:drawing>
                 <wp:inline xmlns:a="http://schemas.openxmlformats.org/drawingml/2006/main" xmlns:pic="http://schemas.openxmlformats.org/drawingml/2006/picture">
-                  <wp:extent cx="4320000" cy="4320000"/>
+                  <wp:extent cx="4320000" cy="5395443"/>
                   <wp:docPr id="12" name="Picture 12"/>
                   <wp:cNvGraphicFramePr>
                     <a:graphicFrameLocks noChangeAspect="1"/>
@@ -1939,11 +1810,11 @@
                     <a:graphicData uri="http://schemas.openxmlformats.org/drawingml/2006/picture">
                       <pic:pic>
                         <pic:nvPicPr>
-                          <pic:cNvPr id="0" name="image.png"/>
+                          <pic:cNvPr id="0" name="image.jpg"/>
                           <pic:cNvPicPr/>
                         </pic:nvPicPr>
                         <pic:blipFill>
-                          <a:blip r:embed="rId12"/>
+                          <a:blip r:embed="rId20"/>
                           <a:stretch>
                             <a:fillRect/>
                           </a:stretch>
@@ -1951,7 +1822,7 @@
                         <pic:spPr>
                           <a:xfrm>
                             <a:off x="0" y="0"/>
-                            <a:ext cx="4320000" cy="4320000"/>
+                            <a:ext cx="4320000" cy="5395443"/>
                           </a:xfrm>
                           <a:prstGeom prst="rect"/>
                         </pic:spPr>
@@ -2014,6 +1885,8 @@
                 <w:b/>
                 <w:color w:val="101018"/>
                 <w:sz w:val="72"/>
+                <w:szCs w:val="72"/>
+                <w:bCs w:val="1"/>
                 <w:rtl w:val="1"/>
               </w:rPr>
               <w:t>ציפור תאילנדי</w:t>
@@ -2058,19 +1931,6 @@
               <w:t>50K–100K SHU</w:t>
             </w:r>
           </w:p>
-          <w:p>
-            <w:pPr>
-              <w:spacing w:before="400"/>
-              <w:jc w:val="right"/>
-            </w:pPr>
-            <w:r>
-              <w:rPr>
-                <w:color w:val="C93030"/>
-                <w:sz w:val="18"/>
-              </w:rPr>
-              <w:t>תמונה לא נטענה — ראה: https://en.wikipedia.org/wiki/Bird%27s_eye_chili</w:t>
-            </w:r>
-          </w:p>
         </w:tc>
         <w:tc>
           <w:tcPr>
@@ -2090,7 +1950,7 @@
             <w:r>
               <w:drawing>
                 <wp:inline xmlns:a="http://schemas.openxmlformats.org/drawingml/2006/main" xmlns:pic="http://schemas.openxmlformats.org/drawingml/2006/picture">
-                  <wp:extent cx="4320000" cy="4320000"/>
+                  <wp:extent cx="4320000" cy="5760000"/>
                   <wp:docPr id="13" name="Picture 13"/>
                   <wp:cNvGraphicFramePr>
                     <a:graphicFrameLocks noChangeAspect="1"/>
@@ -2099,11 +1959,11 @@
                     <a:graphicData uri="http://schemas.openxmlformats.org/drawingml/2006/picture">
                       <pic:pic>
                         <pic:nvPicPr>
-                          <pic:cNvPr id="0" name="image.png"/>
+                          <pic:cNvPr id="0" name="image.jpg"/>
                           <pic:cNvPicPr/>
                         </pic:nvPicPr>
                         <pic:blipFill>
-                          <a:blip r:embed="rId10"/>
+                          <a:blip r:embed="rId21"/>
                           <a:stretch>
                             <a:fillRect/>
                           </a:stretch>
@@ -2111,7 +1971,7 @@
                         <pic:spPr>
                           <a:xfrm>
                             <a:off x="0" y="0"/>
-                            <a:ext cx="4320000" cy="4320000"/>
+                            <a:ext cx="4320000" cy="5760000"/>
                           </a:xfrm>
                           <a:prstGeom prst="rect"/>
                         </pic:spPr>
@@ -2174,6 +2034,8 @@
                 <w:b/>
                 <w:color w:val="101018"/>
                 <w:sz w:val="72"/>
+                <w:szCs w:val="72"/>
+                <w:bCs w:val="1"/>
                 <w:rtl w:val="1"/>
               </w:rPr>
               <w:t>גמיקאן ילו צהוב</w:t>
@@ -2218,19 +2080,6 @@
               <w:t>100K–350K SHU</w:t>
             </w:r>
           </w:p>
-          <w:p>
-            <w:pPr>
-              <w:spacing w:before="400"/>
-              <w:jc w:val="right"/>
-            </w:pPr>
-            <w:r>
-              <w:rPr>
-                <w:color w:val="C93030"/>
-                <w:sz w:val="18"/>
-              </w:rPr>
-              <w:t>תמונה לא נטענה — ראה: https://en.wikipedia.org/wiki/Scotch_bonnet</w:t>
-            </w:r>
-          </w:p>
         </w:tc>
         <w:tc>
           <w:tcPr>
@@ -2259,11 +2108,11 @@
                     <a:graphicData uri="http://schemas.openxmlformats.org/drawingml/2006/picture">
                       <pic:pic>
                         <pic:nvPicPr>
-                          <pic:cNvPr id="0" name="image.png"/>
+                          <pic:cNvPr id="0" name="image.jpg"/>
                           <pic:cNvPicPr/>
                         </pic:nvPicPr>
                         <pic:blipFill>
-                          <a:blip r:embed="rId9"/>
+                          <a:blip r:embed="rId22"/>
                           <a:stretch>
                             <a:fillRect/>
                           </a:stretch>
@@ -2334,6 +2183,8 @@
                 <w:b/>
                 <w:color w:val="101018"/>
                 <w:sz w:val="72"/>
+                <w:szCs w:val="72"/>
+                <w:bCs w:val="1"/>
                 <w:rtl w:val="1"/>
               </w:rPr>
               <w:t>צ׳ילי תאילנדי ארוך</w:t>
@@ -2378,19 +2229,6 @@
               <w:t>15K–50K SHU</w:t>
             </w:r>
           </w:p>
-          <w:p>
-            <w:pPr>
-              <w:spacing w:before="400"/>
-              <w:jc w:val="right"/>
-            </w:pPr>
-            <w:r>
-              <w:rPr>
-                <w:color w:val="C93030"/>
-                <w:sz w:val="18"/>
-              </w:rPr>
-              <w:t>תמונה לא נטענה — ראה: https://en.wikipedia.org/wiki/Thai_pepper</w:t>
-            </w:r>
-          </w:p>
         </w:tc>
         <w:tc>
           <w:tcPr>
@@ -2410,7 +2248,7 @@
             <w:r>
               <w:drawing>
                 <wp:inline xmlns:a="http://schemas.openxmlformats.org/drawingml/2006/main" xmlns:pic="http://schemas.openxmlformats.org/drawingml/2006/picture">
-                  <wp:extent cx="4320000" cy="4320000"/>
+                  <wp:extent cx="4320000" cy="2424304"/>
                   <wp:docPr id="15" name="Picture 15"/>
                   <wp:cNvGraphicFramePr>
                     <a:graphicFrameLocks noChangeAspect="1"/>
@@ -2419,11 +2257,11 @@
                     <a:graphicData uri="http://schemas.openxmlformats.org/drawingml/2006/picture">
                       <pic:pic>
                         <pic:nvPicPr>
-                          <pic:cNvPr id="0" name="image.png"/>
+                          <pic:cNvPr id="0" name="image.jpg"/>
                           <pic:cNvPicPr/>
                         </pic:nvPicPr>
                         <pic:blipFill>
-                          <a:blip r:embed="rId10"/>
+                          <a:blip r:embed="rId23"/>
                           <a:stretch>
                             <a:fillRect/>
                           </a:stretch>
@@ -2431,7 +2269,7 @@
                         <pic:spPr>
                           <a:xfrm>
                             <a:off x="0" y="0"/>
-                            <a:ext cx="4320000" cy="4320000"/>
+                            <a:ext cx="4320000" cy="2424304"/>
                           </a:xfrm>
                           <a:prstGeom prst="rect"/>
                         </pic:spPr>
@@ -2494,6 +2332,8 @@
                 <w:b/>
                 <w:color w:val="101018"/>
                 <w:sz w:val="72"/>
+                <w:szCs w:val="72"/>
+                <w:bCs w:val="1"/>
                 <w:rtl w:val="1"/>
               </w:rPr>
               <w:t>עקרב לבן</w:t>
@@ -2538,19 +2378,6 @@
               <w:t>~1M+ SHU</w:t>
             </w:r>
           </w:p>
-          <w:p>
-            <w:pPr>
-              <w:spacing w:before="400"/>
-              <w:jc w:val="right"/>
-            </w:pPr>
-            <w:r>
-              <w:rPr>
-                <w:color w:val="C93030"/>
-                <w:sz w:val="18"/>
-              </w:rPr>
-              <w:t>תמונה לא נטענה — ראה: https://en.wikipedia.org/wiki/Trinidad_Scorpion_pepper</w:t>
-            </w:r>
-          </w:p>
         </w:tc>
         <w:tc>
           <w:tcPr>
@@ -2579,11 +2406,11 @@
                     <a:graphicData uri="http://schemas.openxmlformats.org/drawingml/2006/picture">
                       <pic:pic>
                         <pic:nvPicPr>
-                          <pic:cNvPr id="0" name="image.png"/>
+                          <pic:cNvPr id="0" name="image.jpg"/>
                           <pic:cNvPicPr/>
                         </pic:nvPicPr>
                         <pic:blipFill>
-                          <a:blip r:embed="rId13"/>
+                          <a:blip r:embed="rId24"/>
                           <a:stretch>
                             <a:fillRect/>
                           </a:stretch>
@@ -2654,6 +2481,8 @@
                 <w:b/>
                 <w:color w:val="101018"/>
                 <w:sz w:val="72"/>
+                <w:szCs w:val="72"/>
+                <w:bCs w:val="1"/>
                 <w:rtl w:val="1"/>
               </w:rPr>
               <w:t>דובדבן אדום</w:t>
@@ -2698,19 +2527,6 @@
               <w:t>100–500 SHU</w:t>
             </w:r>
           </w:p>
-          <w:p>
-            <w:pPr>
-              <w:spacing w:before="400"/>
-              <w:jc w:val="right"/>
-            </w:pPr>
-            <w:r>
-              <w:rPr>
-                <w:color w:val="C93030"/>
-                <w:sz w:val="18"/>
-              </w:rPr>
-              <w:t>תמונה לא נטענה — ראה: https://en.wikipedia.org/wiki/Pimiento</w:t>
-            </w:r>
-          </w:p>
         </w:tc>
         <w:tc>
           <w:tcPr>
@@ -2730,7 +2546,7 @@
             <w:r>
               <w:drawing>
                 <wp:inline xmlns:a="http://schemas.openxmlformats.org/drawingml/2006/main" xmlns:pic="http://schemas.openxmlformats.org/drawingml/2006/picture">
-                  <wp:extent cx="4320000" cy="4320000"/>
+                  <wp:extent cx="4320000" cy="3089620"/>
                   <wp:docPr id="17" name="Picture 17"/>
                   <wp:cNvGraphicFramePr>
                     <a:graphicFrameLocks noChangeAspect="1"/>
@@ -2739,11 +2555,11 @@
                     <a:graphicData uri="http://schemas.openxmlformats.org/drawingml/2006/picture">
                       <pic:pic>
                         <pic:nvPicPr>
-                          <pic:cNvPr id="0" name="image.png"/>
+                          <pic:cNvPr id="0" name="image.jpg"/>
                           <pic:cNvPicPr/>
                         </pic:nvPicPr>
                         <pic:blipFill>
-                          <a:blip r:embed="rId10"/>
+                          <a:blip r:embed="rId25"/>
                           <a:stretch>
                             <a:fillRect/>
                           </a:stretch>
@@ -2751,7 +2567,7 @@
                         <pic:spPr>
                           <a:xfrm>
                             <a:off x="0" y="0"/>
-                            <a:ext cx="4320000" cy="4320000"/>
+                            <a:ext cx="4320000" cy="3089620"/>
                           </a:xfrm>
                           <a:prstGeom prst="rect"/>
                         </pic:spPr>
@@ -2814,6 +2630,8 @@
                 <w:b/>
                 <w:color w:val="101018"/>
                 <w:sz w:val="72"/>
+                <w:szCs w:val="72"/>
+                <w:bCs w:val="1"/>
                 <w:rtl w:val="1"/>
               </w:rPr>
               <w:t>קריולה סלה</w:t>
@@ -2858,19 +2676,6 @@
               <w:t>~30K SHU</w:t>
             </w:r>
           </w:p>
-          <w:p>
-            <w:pPr>
-              <w:spacing w:before="400"/>
-              <w:jc w:val="right"/>
-            </w:pPr>
-            <w:r>
-              <w:rPr>
-                <w:color w:val="C93030"/>
-                <w:sz w:val="18"/>
-              </w:rPr>
-              <w:t>תמונה לא נטענה — ראה: https://en.wikipedia.org/wiki/Capsicum_baccatum</w:t>
-            </w:r>
-          </w:p>
         </w:tc>
         <w:tc>
           <w:tcPr>
@@ -2890,7 +2695,7 @@
             <w:r>
               <w:drawing>
                 <wp:inline xmlns:a="http://schemas.openxmlformats.org/drawingml/2006/main" xmlns:pic="http://schemas.openxmlformats.org/drawingml/2006/picture">
-                  <wp:extent cx="4320000" cy="4320000"/>
+                  <wp:extent cx="4320000" cy="3773165"/>
                   <wp:docPr id="18" name="Picture 18"/>
                   <wp:cNvGraphicFramePr>
                     <a:graphicFrameLocks noChangeAspect="1"/>
@@ -2899,11 +2704,11 @@
                     <a:graphicData uri="http://schemas.openxmlformats.org/drawingml/2006/picture">
                       <pic:pic>
                         <pic:nvPicPr>
-                          <pic:cNvPr id="0" name="image.png"/>
+                          <pic:cNvPr id="0" name="image.jpg"/>
                           <pic:cNvPicPr/>
                         </pic:nvPicPr>
                         <pic:blipFill>
-                          <a:blip r:embed="rId9"/>
+                          <a:blip r:embed="rId26"/>
                           <a:stretch>
                             <a:fillRect/>
                           </a:stretch>
@@ -2911,7 +2716,7 @@
                         <pic:spPr>
                           <a:xfrm>
                             <a:off x="0" y="0"/>
-                            <a:ext cx="4320000" cy="4320000"/>
+                            <a:ext cx="4320000" cy="3773165"/>
                           </a:xfrm>
                           <a:prstGeom prst="rect"/>
                         </pic:spPr>
@@ -2974,6 +2779,8 @@
                 <w:b/>
                 <w:color w:val="101018"/>
                 <w:sz w:val="72"/>
+                <w:szCs w:val="72"/>
+                <w:bCs w:val="1"/>
                 <w:rtl w:val="1"/>
               </w:rPr>
               <w:t>אנברו מנורת לילה</w:t>
@@ -3018,19 +2825,6 @@
               <w:t>5K–30K SHU</w:t>
             </w:r>
           </w:p>
-          <w:p>
-            <w:pPr>
-              <w:spacing w:before="400"/>
-              <w:jc w:val="right"/>
-            </w:pPr>
-            <w:r>
-              <w:rPr>
-                <w:color w:val="C93030"/>
-                <w:sz w:val="18"/>
-              </w:rPr>
-              <w:t>תמונה לא נטענה — ראה: https://en.wikipedia.org/wiki/Bishop%27s_crown</w:t>
-            </w:r>
-          </w:p>
         </w:tc>
         <w:tc>
           <w:tcPr>
@@ -3059,11 +2853,11 @@
                     <a:graphicData uri="http://schemas.openxmlformats.org/drawingml/2006/picture">
                       <pic:pic>
                         <pic:nvPicPr>
-                          <pic:cNvPr id="0" name="image.png"/>
+                          <pic:cNvPr id="0" name="image.jpg"/>
                           <pic:cNvPicPr/>
                         </pic:nvPicPr>
                         <pic:blipFill>
-                          <a:blip r:embed="rId14"/>
+                          <a:blip r:embed="rId27"/>
                           <a:stretch>
                             <a:fillRect/>
                           </a:stretch>

</xml_diff>

<commit_message>
restore 20-pepper deck (slot 3 = 'אנברו ריפר אדום')
Per user request, slide 3 ('אנברו ריפר אדום') is restored as a
distinct slot alongside slide 9 ('קרולינה ריפר אדום'). Both share
the Carolina Reaper Red identity (per earlier confirmation) but use
different image search queries so the two slides show different
photos of the same variety.

Output: docs/peppers-2026.{docx,pdf} now have 21 pages — title +
20 pepper slides.

https://claude.ai/code/session_01F5sStxgq1EVBAbHf6eXV38
</commit_message>
<xml_diff>
--- a/docs/peppers-2026.docx
+++ b/docs/peppers-2026.docx
@@ -45,7 +45,7 @@
           <w:szCs w:val="28"/>
           <w:rtl w:val="1"/>
         </w:rPr>
-        <w:t>19 זנים — שמות עבריים, אנגליים ותמונות</w:t>
+        <w:t>20 זנים — שמות עבריים, אנגליים ותמונות</w:t>
       </w:r>
     </w:p>
     <w:p>
@@ -84,7 +84,7 @@
                 <w:color w:val="9090A0"/>
                 <w:sz w:val="24"/>
               </w:rPr>
-              <w:t>1 / 19</w:t>
+              <w:t>1 / 20</w:t>
             </w:r>
           </w:p>
           <w:p>
@@ -162,7 +162,7 @@
             <w:r>
               <w:drawing>
                 <wp:inline xmlns:a="http://schemas.openxmlformats.org/drawingml/2006/main" xmlns:pic="http://schemas.openxmlformats.org/drawingml/2006/picture">
-                  <wp:extent cx="4320000" cy="4320000"/>
+                  <wp:extent cx="4320000" cy="2880000"/>
                   <wp:docPr id="1" name="Picture 1"/>
                   <wp:cNvGraphicFramePr>
                     <a:graphicFrameLocks noChangeAspect="1"/>
@@ -183,7 +183,7 @@
                         <pic:spPr>
                           <a:xfrm>
                             <a:off x="0" y="0"/>
-                            <a:ext cx="4320000" cy="4320000"/>
+                            <a:ext cx="4320000" cy="2880000"/>
                           </a:xfrm>
                           <a:prstGeom prst="rect"/>
                         </pic:spPr>
@@ -233,7 +233,7 @@
                 <w:color w:val="9090A0"/>
                 <w:sz w:val="24"/>
               </w:rPr>
-              <w:t>2 / 19</w:t>
+              <w:t>2 / 20</w:t>
             </w:r>
           </w:p>
           <w:p>
@@ -311,7 +311,7 @@
             <w:r>
               <w:drawing>
                 <wp:inline xmlns:a="http://schemas.openxmlformats.org/drawingml/2006/main" xmlns:pic="http://schemas.openxmlformats.org/drawingml/2006/picture">
-                  <wp:extent cx="4320000" cy="6480000"/>
+                  <wp:extent cx="4320000" cy="4320000"/>
                   <wp:docPr id="2" name="Picture 2"/>
                   <wp:cNvGraphicFramePr>
                     <a:graphicFrameLocks noChangeAspect="1"/>
@@ -332,7 +332,7 @@
                         <pic:spPr>
                           <a:xfrm>
                             <a:off x="0" y="0"/>
-                            <a:ext cx="4320000" cy="6480000"/>
+                            <a:ext cx="4320000" cy="4320000"/>
                           </a:xfrm>
                           <a:prstGeom prst="rect"/>
                         </pic:spPr>
@@ -382,7 +382,7 @@
                 <w:color w:val="9090A0"/>
                 <w:sz w:val="24"/>
               </w:rPr>
-              <w:t>3 / 19</w:t>
+              <w:t>3 / 20</w:t>
             </w:r>
           </w:p>
           <w:p>
@@ -399,7 +399,7 @@
                 <w:bCs w:val="1"/>
                 <w:rtl w:val="1"/>
               </w:rPr>
-              <w:t>קרולינה ריפר אדום</w:t>
+              <w:t>אנברו ריפר אדום</w:t>
             </w:r>
           </w:p>
           <w:p>
@@ -460,7 +460,7 @@
             <w:r>
               <w:drawing>
                 <wp:inline xmlns:a="http://schemas.openxmlformats.org/drawingml/2006/main" xmlns:pic="http://schemas.openxmlformats.org/drawingml/2006/picture">
-                  <wp:extent cx="4320000" cy="2870886"/>
+                  <wp:extent cx="4320000" cy="2880000"/>
                   <wp:docPr id="3" name="Picture 3"/>
                   <wp:cNvGraphicFramePr>
                     <a:graphicFrameLocks noChangeAspect="1"/>
@@ -481,7 +481,7 @@
                         <pic:spPr>
                           <a:xfrm>
                             <a:off x="0" y="0"/>
-                            <a:ext cx="4320000" cy="2870886"/>
+                            <a:ext cx="4320000" cy="2880000"/>
                           </a:xfrm>
                           <a:prstGeom prst="rect"/>
                         </pic:spPr>
@@ -531,7 +531,7 @@
                 <w:color w:val="9090A0"/>
                 <w:sz w:val="24"/>
               </w:rPr>
-              <w:t>4 / 19</w:t>
+              <w:t>4 / 20</w:t>
             </w:r>
           </w:p>
           <w:p>
@@ -680,7 +680,7 @@
                 <w:color w:val="9090A0"/>
                 <w:sz w:val="24"/>
               </w:rPr>
-              <w:t>5 / 19</w:t>
+              <w:t>5 / 20</w:t>
             </w:r>
           </w:p>
           <w:p>
@@ -829,7 +829,7 @@
                 <w:color w:val="9090A0"/>
                 <w:sz w:val="24"/>
               </w:rPr>
-              <w:t>6 / 19</w:t>
+              <w:t>6 / 20</w:t>
             </w:r>
           </w:p>
           <w:p>
@@ -978,7 +978,7 @@
                 <w:color w:val="9090A0"/>
                 <w:sz w:val="24"/>
               </w:rPr>
-              <w:t>7 / 19</w:t>
+              <w:t>7 / 20</w:t>
             </w:r>
           </w:p>
           <w:p>
@@ -1127,7 +1127,7 @@
                 <w:color w:val="9090A0"/>
                 <w:sz w:val="24"/>
               </w:rPr>
-              <w:t>8 / 19</w:t>
+              <w:t>8 / 20</w:t>
             </w:r>
           </w:p>
           <w:p>
@@ -1276,7 +1276,7 @@
                 <w:color w:val="9090A0"/>
                 <w:sz w:val="24"/>
               </w:rPr>
-              <w:t>9 / 19</w:t>
+              <w:t>9 / 20</w:t>
             </w:r>
           </w:p>
           <w:p>
@@ -1293,7 +1293,7 @@
                 <w:bCs w:val="1"/>
                 <w:rtl w:val="1"/>
               </w:rPr>
-              <w:t>גוליקה בהוט צהוב</w:t>
+              <w:t>קרולינה ריפר אדום</w:t>
             </w:r>
           </w:p>
           <w:p>
@@ -1306,7 +1306,7 @@
                 <w:color w:val="555566"/>
                 <w:sz w:val="36"/>
               </w:rPr>
-              <w:t>Yellow Bhut Jolokia</w:t>
+              <w:t>Carolina Reaper (Red)</w:t>
             </w:r>
           </w:p>
           <w:p>
@@ -1319,7 +1319,7 @@
                 <w:color w:val="555566"/>
                 <w:sz w:val="22"/>
               </w:rPr>
-              <w:t>Capsicum chinense × frutescens</w:t>
+              <w:t>Capsicum chinense</w:t>
             </w:r>
             <w:r>
               <w:rPr>
@@ -1332,7 +1332,7 @@
                 <w:color w:val="555566"/>
                 <w:sz w:val="22"/>
               </w:rPr>
-              <w:t>~800K–1M SHU</w:t>
+              <w:t>~1.6M–2.2M SHU</w:t>
             </w:r>
           </w:p>
         </w:tc>
@@ -1425,7 +1425,7 @@
                 <w:color w:val="9090A0"/>
                 <w:sz w:val="24"/>
               </w:rPr>
-              <w:t>10 / 19</w:t>
+              <w:t>10 / 20</w:t>
             </w:r>
           </w:p>
           <w:p>
@@ -1442,7 +1442,7 @@
                 <w:bCs w:val="1"/>
                 <w:rtl w:val="1"/>
               </w:rPr>
-              <w:t>סקורפיו ריפר אדום</w:t>
+              <w:t>גוליקה בהוט צהוב</w:t>
             </w:r>
           </w:p>
           <w:p>
@@ -1455,7 +1455,7 @@
                 <w:color w:val="555566"/>
                 <w:sz w:val="36"/>
               </w:rPr>
-              <w:t>Trinidad Scorpion (Red)</w:t>
+              <w:t>Yellow Bhut Jolokia</w:t>
             </w:r>
           </w:p>
           <w:p>
@@ -1468,7 +1468,7 @@
                 <w:color w:val="555566"/>
                 <w:sz w:val="22"/>
               </w:rPr>
-              <w:t>Capsicum chinense</w:t>
+              <w:t>Capsicum chinense × frutescens</w:t>
             </w:r>
             <w:r>
               <w:rPr>
@@ -1481,7 +1481,7 @@
                 <w:color w:val="555566"/>
                 <w:sz w:val="22"/>
               </w:rPr>
-              <w:t>~1.2M–2M SHU</w:t>
+              <w:t>~800K–1M SHU</w:t>
             </w:r>
           </w:p>
         </w:tc>
@@ -1574,7 +1574,7 @@
                 <w:color w:val="9090A0"/>
                 <w:sz w:val="24"/>
               </w:rPr>
-              <w:t>11 / 19</w:t>
+              <w:t>11 / 20</w:t>
             </w:r>
           </w:p>
           <w:p>
@@ -1591,7 +1591,7 @@
                 <w:bCs w:val="1"/>
                 <w:rtl w:val="1"/>
               </w:rPr>
-              <w:t>צ׳רי בומב אדום</w:t>
+              <w:t>סקורפיו ריפר אדום</w:t>
             </w:r>
           </w:p>
           <w:p>
@@ -1604,7 +1604,7 @@
                 <w:color w:val="555566"/>
                 <w:sz w:val="36"/>
               </w:rPr>
-              <w:t>Cherry Bomb (F1)</w:t>
+              <w:t>Trinidad Scorpion (Red)</w:t>
             </w:r>
           </w:p>
           <w:p>
@@ -1617,7 +1617,7 @@
                 <w:color w:val="555566"/>
                 <w:sz w:val="22"/>
               </w:rPr>
-              <w:t>Capsicum annuum</w:t>
+              <w:t>Capsicum chinense</w:t>
             </w:r>
             <w:r>
               <w:rPr>
@@ -1630,7 +1630,7 @@
                 <w:color w:val="555566"/>
                 <w:sz w:val="22"/>
               </w:rPr>
-              <w:t>2.5K–5K SHU</w:t>
+              <w:t>~1.2M–2M SHU</w:t>
             </w:r>
           </w:p>
         </w:tc>
@@ -1723,7 +1723,156 @@
                 <w:color w:val="9090A0"/>
                 <w:sz w:val="24"/>
               </w:rPr>
-              <w:t>12 / 19</w:t>
+              <w:t>12 / 20</w:t>
+            </w:r>
+          </w:p>
+          <w:p>
+            <w:pPr>
+              <w:spacing w:before="160"/>
+              <w:jc w:val="right"/>
+            </w:pPr>
+            <w:r>
+              <w:rPr>
+                <w:b/>
+                <w:color w:val="101018"/>
+                <w:sz w:val="72"/>
+                <w:szCs w:val="72"/>
+                <w:bCs w:val="1"/>
+                <w:rtl w:val="1"/>
+              </w:rPr>
+              <w:t>צ׳רי בומב אדום</w:t>
+            </w:r>
+          </w:p>
+          <w:p>
+            <w:pPr>
+              <w:jc w:val="right"/>
+            </w:pPr>
+            <w:r>
+              <w:rPr>
+                <w:i/>
+                <w:color w:val="555566"/>
+                <w:sz w:val="36"/>
+              </w:rPr>
+              <w:t>Cherry Bomb (F1)</w:t>
+            </w:r>
+          </w:p>
+          <w:p>
+            <w:pPr>
+              <w:spacing w:before="320"/>
+              <w:jc w:val="right"/>
+            </w:pPr>
+            <w:r>
+              <w:rPr>
+                <w:color w:val="555566"/>
+                <w:sz w:val="22"/>
+              </w:rPr>
+              <w:t>Capsicum annuum</w:t>
+            </w:r>
+            <w:r>
+              <w:rPr>
+                <w:color w:val="AAAAB8"/>
+              </w:rPr>
+              <w:t xml:space="preserve">   ·   </w:t>
+            </w:r>
+            <w:r>
+              <w:rPr>
+                <w:color w:val="555566"/>
+                <w:sz w:val="22"/>
+              </w:rPr>
+              <w:t>2.5K–5K SHU</w:t>
+            </w:r>
+          </w:p>
+        </w:tc>
+        <w:tc>
+          <w:tcPr>
+            <w:tcW w:type="dxa" w:w="6786"/>
+            <w:vAlign w:val="center"/>
+            <w:tcBorders>
+              <w:top w:val="single" w:sz="12" w:color="1A2236"/>
+              <w:left w:val="single" w:sz="12" w:color="1A2236"/>
+              <w:bottom w:val="single" w:sz="12" w:color="1A2236"/>
+              <w:right w:val="single" w:sz="12" w:color="1A2236"/>
+            </w:tcBorders>
+          </w:tcPr>
+          <w:p>
+            <w:pPr>
+              <w:jc w:val="center"/>
+            </w:pPr>
+            <w:r>
+              <w:drawing>
+                <wp:inline xmlns:a="http://schemas.openxmlformats.org/drawingml/2006/main" xmlns:pic="http://schemas.openxmlformats.org/drawingml/2006/picture">
+                  <wp:extent cx="4320000" cy="4320000"/>
+                  <wp:docPr id="12" name="Picture 12"/>
+                  <wp:cNvGraphicFramePr>
+                    <a:graphicFrameLocks noChangeAspect="1"/>
+                  </wp:cNvGraphicFramePr>
+                  <a:graphic>
+                    <a:graphicData uri="http://schemas.openxmlformats.org/drawingml/2006/picture">
+                      <pic:pic>
+                        <pic:nvPicPr>
+                          <pic:cNvPr id="0" name="image.jpg"/>
+                          <pic:cNvPicPr/>
+                        </pic:nvPicPr>
+                        <pic:blipFill>
+                          <a:blip r:embed="rId20"/>
+                          <a:stretch>
+                            <a:fillRect/>
+                          </a:stretch>
+                        </pic:blipFill>
+                        <pic:spPr>
+                          <a:xfrm>
+                            <a:off x="0" y="0"/>
+                            <a:ext cx="4320000" cy="4320000"/>
+                          </a:xfrm>
+                          <a:prstGeom prst="rect"/>
+                        </pic:spPr>
+                      </pic:pic>
+                    </a:graphicData>
+                  </a:graphic>
+                </wp:inline>
+              </w:drawing>
+            </w:r>
+          </w:p>
+        </w:tc>
+      </w:tr>
+    </w:tbl>
+    <w:p>
+      <w:r>
+        <w:br w:type="page"/>
+      </w:r>
+    </w:p>
+    <w:tbl>
+      <w:tblPr>
+        <w:tblW w:type="auto" w:w="0"/>
+        <w:tblLayout w:type="fixed"/>
+        <w:tblLook w:firstColumn="1" w:firstRow="1" w:lastColumn="0" w:lastRow="0" w:noHBand="0" w:noVBand="1" w:val="04A0"/>
+      </w:tblPr>
+      <w:tblGrid>
+        <w:gridCol w:w="6803"/>
+        <w:gridCol w:w="7370"/>
+      </w:tblGrid>
+      <w:tr>
+        <w:tc>
+          <w:tcPr>
+            <w:tcW w:type="dxa" w:w="6786"/>
+            <w:vAlign w:val="center"/>
+            <w:tcBorders>
+              <w:top w:val="single" w:sz="0" w:color="FFFFFF"/>
+              <w:left w:val="single" w:sz="0" w:color="FFFFFF"/>
+              <w:bottom w:val="single" w:sz="0" w:color="FFFFFF"/>
+              <w:right w:val="single" w:sz="0" w:color="FFFFFF"/>
+            </w:tcBorders>
+          </w:tcPr>
+          <w:p>
+            <w:pPr>
+              <w:jc w:val="right"/>
+            </w:pPr>
+            <w:r>
+              <w:rPr>
+                <w:color w:val="9090A0"/>
+                <w:sz w:val="24"/>
+              </w:rPr>
+              <w:t>13 / 20</w:t>
             </w:r>
           </w:p>
           <w:p>
@@ -1780,155 +1929,6 @@
                 <w:sz w:val="22"/>
               </w:rPr>
               <w:t>~800K–1M SHU</w:t>
-            </w:r>
-          </w:p>
-        </w:tc>
-        <w:tc>
-          <w:tcPr>
-            <w:tcW w:type="dxa" w:w="6786"/>
-            <w:vAlign w:val="center"/>
-            <w:tcBorders>
-              <w:top w:val="single" w:sz="12" w:color="1A2236"/>
-              <w:left w:val="single" w:sz="12" w:color="1A2236"/>
-              <w:bottom w:val="single" w:sz="12" w:color="1A2236"/>
-              <w:right w:val="single" w:sz="12" w:color="1A2236"/>
-            </w:tcBorders>
-          </w:tcPr>
-          <w:p>
-            <w:pPr>
-              <w:jc w:val="center"/>
-            </w:pPr>
-            <w:r>
-              <w:drawing>
-                <wp:inline xmlns:a="http://schemas.openxmlformats.org/drawingml/2006/main" xmlns:pic="http://schemas.openxmlformats.org/drawingml/2006/picture">
-                  <wp:extent cx="4320000" cy="5395443"/>
-                  <wp:docPr id="12" name="Picture 12"/>
-                  <wp:cNvGraphicFramePr>
-                    <a:graphicFrameLocks noChangeAspect="1"/>
-                  </wp:cNvGraphicFramePr>
-                  <a:graphic>
-                    <a:graphicData uri="http://schemas.openxmlformats.org/drawingml/2006/picture">
-                      <pic:pic>
-                        <pic:nvPicPr>
-                          <pic:cNvPr id="0" name="image.jpg"/>
-                          <pic:cNvPicPr/>
-                        </pic:nvPicPr>
-                        <pic:blipFill>
-                          <a:blip r:embed="rId20"/>
-                          <a:stretch>
-                            <a:fillRect/>
-                          </a:stretch>
-                        </pic:blipFill>
-                        <pic:spPr>
-                          <a:xfrm>
-                            <a:off x="0" y="0"/>
-                            <a:ext cx="4320000" cy="5395443"/>
-                          </a:xfrm>
-                          <a:prstGeom prst="rect"/>
-                        </pic:spPr>
-                      </pic:pic>
-                    </a:graphicData>
-                  </a:graphic>
-                </wp:inline>
-              </w:drawing>
-            </w:r>
-          </w:p>
-        </w:tc>
-      </w:tr>
-    </w:tbl>
-    <w:p>
-      <w:r>
-        <w:br w:type="page"/>
-      </w:r>
-    </w:p>
-    <w:tbl>
-      <w:tblPr>
-        <w:tblW w:type="auto" w:w="0"/>
-        <w:tblLayout w:type="fixed"/>
-        <w:tblLook w:firstColumn="1" w:firstRow="1" w:lastColumn="0" w:lastRow="0" w:noHBand="0" w:noVBand="1" w:val="04A0"/>
-      </w:tblPr>
-      <w:tblGrid>
-        <w:gridCol w:w="6803"/>
-        <w:gridCol w:w="7370"/>
-      </w:tblGrid>
-      <w:tr>
-        <w:tc>
-          <w:tcPr>
-            <w:tcW w:type="dxa" w:w="6786"/>
-            <w:vAlign w:val="center"/>
-            <w:tcBorders>
-              <w:top w:val="single" w:sz="0" w:color="FFFFFF"/>
-              <w:left w:val="single" w:sz="0" w:color="FFFFFF"/>
-              <w:bottom w:val="single" w:sz="0" w:color="FFFFFF"/>
-              <w:right w:val="single" w:sz="0" w:color="FFFFFF"/>
-            </w:tcBorders>
-          </w:tcPr>
-          <w:p>
-            <w:pPr>
-              <w:jc w:val="right"/>
-            </w:pPr>
-            <w:r>
-              <w:rPr>
-                <w:color w:val="9090A0"/>
-                <w:sz w:val="24"/>
-              </w:rPr>
-              <w:t>13 / 19</w:t>
-            </w:r>
-          </w:p>
-          <w:p>
-            <w:pPr>
-              <w:spacing w:before="160"/>
-              <w:jc w:val="right"/>
-            </w:pPr>
-            <w:r>
-              <w:rPr>
-                <w:b/>
-                <w:color w:val="101018"/>
-                <w:sz w:val="72"/>
-                <w:szCs w:val="72"/>
-                <w:bCs w:val="1"/>
-                <w:rtl w:val="1"/>
-              </w:rPr>
-              <w:t>ציפור תאילנדי</w:t>
-            </w:r>
-          </w:p>
-          <w:p>
-            <w:pPr>
-              <w:jc w:val="right"/>
-            </w:pPr>
-            <w:r>
-              <w:rPr>
-                <w:i/>
-                <w:color w:val="555566"/>
-                <w:sz w:val="36"/>
-              </w:rPr>
-              <w:t>Thai Bird's Eye</w:t>
-            </w:r>
-          </w:p>
-          <w:p>
-            <w:pPr>
-              <w:spacing w:before="320"/>
-              <w:jc w:val="right"/>
-            </w:pPr>
-            <w:r>
-              <w:rPr>
-                <w:color w:val="555566"/>
-                <w:sz w:val="22"/>
-              </w:rPr>
-              <w:t>Capsicum annuum</w:t>
-            </w:r>
-            <w:r>
-              <w:rPr>
-                <w:color w:val="AAAAB8"/>
-              </w:rPr>
-              <w:t xml:space="preserve">   ·   </w:t>
-            </w:r>
-            <w:r>
-              <w:rPr>
-                <w:color w:val="555566"/>
-                <w:sz w:val="22"/>
-              </w:rPr>
-              <w:t>50K–100K SHU</w:t>
             </w:r>
           </w:p>
         </w:tc>
@@ -2021,7 +2021,156 @@
                 <w:color w:val="9090A0"/>
                 <w:sz w:val="24"/>
               </w:rPr>
-              <w:t>14 / 19</w:t>
+              <w:t>14 / 20</w:t>
+            </w:r>
+          </w:p>
+          <w:p>
+            <w:pPr>
+              <w:spacing w:before="160"/>
+              <w:jc w:val="right"/>
+            </w:pPr>
+            <w:r>
+              <w:rPr>
+                <w:b/>
+                <w:color w:val="101018"/>
+                <w:sz w:val="72"/>
+                <w:szCs w:val="72"/>
+                <w:bCs w:val="1"/>
+                <w:rtl w:val="1"/>
+              </w:rPr>
+              <w:t>ציפור תאילנדי</w:t>
+            </w:r>
+          </w:p>
+          <w:p>
+            <w:pPr>
+              <w:jc w:val="right"/>
+            </w:pPr>
+            <w:r>
+              <w:rPr>
+                <w:i/>
+                <w:color w:val="555566"/>
+                <w:sz w:val="36"/>
+              </w:rPr>
+              <w:t>Thai Bird's Eye</w:t>
+            </w:r>
+          </w:p>
+          <w:p>
+            <w:pPr>
+              <w:spacing w:before="320"/>
+              <w:jc w:val="right"/>
+            </w:pPr>
+            <w:r>
+              <w:rPr>
+                <w:color w:val="555566"/>
+                <w:sz w:val="22"/>
+              </w:rPr>
+              <w:t>Capsicum annuum</w:t>
+            </w:r>
+            <w:r>
+              <w:rPr>
+                <w:color w:val="AAAAB8"/>
+              </w:rPr>
+              <w:t xml:space="preserve">   ·   </w:t>
+            </w:r>
+            <w:r>
+              <w:rPr>
+                <w:color w:val="555566"/>
+                <w:sz w:val="22"/>
+              </w:rPr>
+              <w:t>50K–100K SHU</w:t>
+            </w:r>
+          </w:p>
+        </w:tc>
+        <w:tc>
+          <w:tcPr>
+            <w:tcW w:type="dxa" w:w="6786"/>
+            <w:vAlign w:val="center"/>
+            <w:tcBorders>
+              <w:top w:val="single" w:sz="12" w:color="1A2236"/>
+              <w:left w:val="single" w:sz="12" w:color="1A2236"/>
+              <w:bottom w:val="single" w:sz="12" w:color="1A2236"/>
+              <w:right w:val="single" w:sz="12" w:color="1A2236"/>
+            </w:tcBorders>
+          </w:tcPr>
+          <w:p>
+            <w:pPr>
+              <w:jc w:val="center"/>
+            </w:pPr>
+            <w:r>
+              <w:drawing>
+                <wp:inline xmlns:a="http://schemas.openxmlformats.org/drawingml/2006/main" xmlns:pic="http://schemas.openxmlformats.org/drawingml/2006/picture">
+                  <wp:extent cx="4320000" cy="5760000"/>
+                  <wp:docPr id="14" name="Picture 14"/>
+                  <wp:cNvGraphicFramePr>
+                    <a:graphicFrameLocks noChangeAspect="1"/>
+                  </wp:cNvGraphicFramePr>
+                  <a:graphic>
+                    <a:graphicData uri="http://schemas.openxmlformats.org/drawingml/2006/picture">
+                      <pic:pic>
+                        <pic:nvPicPr>
+                          <pic:cNvPr id="0" name="image.jpg"/>
+                          <pic:cNvPicPr/>
+                        </pic:nvPicPr>
+                        <pic:blipFill>
+                          <a:blip r:embed="rId22"/>
+                          <a:stretch>
+                            <a:fillRect/>
+                          </a:stretch>
+                        </pic:blipFill>
+                        <pic:spPr>
+                          <a:xfrm>
+                            <a:off x="0" y="0"/>
+                            <a:ext cx="4320000" cy="5760000"/>
+                          </a:xfrm>
+                          <a:prstGeom prst="rect"/>
+                        </pic:spPr>
+                      </pic:pic>
+                    </a:graphicData>
+                  </a:graphic>
+                </wp:inline>
+              </w:drawing>
+            </w:r>
+          </w:p>
+        </w:tc>
+      </w:tr>
+    </w:tbl>
+    <w:p>
+      <w:r>
+        <w:br w:type="page"/>
+      </w:r>
+    </w:p>
+    <w:tbl>
+      <w:tblPr>
+        <w:tblW w:type="auto" w:w="0"/>
+        <w:tblLayout w:type="fixed"/>
+        <w:tblLook w:firstColumn="1" w:firstRow="1" w:lastColumn="0" w:lastRow="0" w:noHBand="0" w:noVBand="1" w:val="04A0"/>
+      </w:tblPr>
+      <w:tblGrid>
+        <w:gridCol w:w="6803"/>
+        <w:gridCol w:w="7370"/>
+      </w:tblGrid>
+      <w:tr>
+        <w:tc>
+          <w:tcPr>
+            <w:tcW w:type="dxa" w:w="6786"/>
+            <w:vAlign w:val="center"/>
+            <w:tcBorders>
+              <w:top w:val="single" w:sz="0" w:color="FFFFFF"/>
+              <w:left w:val="single" w:sz="0" w:color="FFFFFF"/>
+              <w:bottom w:val="single" w:sz="0" w:color="FFFFFF"/>
+              <w:right w:val="single" w:sz="0" w:color="FFFFFF"/>
+            </w:tcBorders>
+          </w:tcPr>
+          <w:p>
+            <w:pPr>
+              <w:jc w:val="right"/>
+            </w:pPr>
+            <w:r>
+              <w:rPr>
+                <w:color w:val="9090A0"/>
+                <w:sz w:val="24"/>
+              </w:rPr>
+              <w:t>15 / 20</w:t>
             </w:r>
           </w:p>
           <w:p>
@@ -2100,7 +2249,7 @@
               <w:drawing>
                 <wp:inline xmlns:a="http://schemas.openxmlformats.org/drawingml/2006/main" xmlns:pic="http://schemas.openxmlformats.org/drawingml/2006/picture">
                   <wp:extent cx="4320000" cy="4320000"/>
-                  <wp:docPr id="14" name="Picture 14"/>
+                  <wp:docPr id="15" name="Picture 15"/>
                   <wp:cNvGraphicFramePr>
                     <a:graphicFrameLocks noChangeAspect="1"/>
                   </wp:cNvGraphicFramePr>
@@ -2112,7 +2261,7 @@
                           <pic:cNvPicPr/>
                         </pic:nvPicPr>
                         <pic:blipFill>
-                          <a:blip r:embed="rId22"/>
+                          <a:blip r:embed="rId23"/>
                           <a:stretch>
                             <a:fillRect/>
                           </a:stretch>
@@ -2170,7 +2319,7 @@
                 <w:color w:val="9090A0"/>
                 <w:sz w:val="24"/>
               </w:rPr>
-              <w:t>15 / 19</w:t>
+              <w:t>16 / 20</w:t>
             </w:r>
           </w:p>
           <w:p>
@@ -2249,7 +2398,7 @@
               <w:drawing>
                 <wp:inline xmlns:a="http://schemas.openxmlformats.org/drawingml/2006/main" xmlns:pic="http://schemas.openxmlformats.org/drawingml/2006/picture">
                   <wp:extent cx="4320000" cy="2424304"/>
-                  <wp:docPr id="15" name="Picture 15"/>
+                  <wp:docPr id="16" name="Picture 16"/>
                   <wp:cNvGraphicFramePr>
                     <a:graphicFrameLocks noChangeAspect="1"/>
                   </wp:cNvGraphicFramePr>
@@ -2261,7 +2410,7 @@
                           <pic:cNvPicPr/>
                         </pic:nvPicPr>
                         <pic:blipFill>
-                          <a:blip r:embed="rId23"/>
+                          <a:blip r:embed="rId24"/>
                           <a:stretch>
                             <a:fillRect/>
                           </a:stretch>
@@ -2319,7 +2468,7 @@
                 <w:color w:val="9090A0"/>
                 <w:sz w:val="24"/>
               </w:rPr>
-              <w:t>16 / 19</w:t>
+              <w:t>17 / 20</w:t>
             </w:r>
           </w:p>
           <w:p>
@@ -2398,7 +2547,7 @@
               <w:drawing>
                 <wp:inline xmlns:a="http://schemas.openxmlformats.org/drawingml/2006/main" xmlns:pic="http://schemas.openxmlformats.org/drawingml/2006/picture">
                   <wp:extent cx="4320000" cy="4320000"/>
-                  <wp:docPr id="16" name="Picture 16"/>
+                  <wp:docPr id="17" name="Picture 17"/>
                   <wp:cNvGraphicFramePr>
                     <a:graphicFrameLocks noChangeAspect="1"/>
                   </wp:cNvGraphicFramePr>
@@ -2410,7 +2559,7 @@
                           <pic:cNvPicPr/>
                         </pic:nvPicPr>
                         <pic:blipFill>
-                          <a:blip r:embed="rId24"/>
+                          <a:blip r:embed="rId25"/>
                           <a:stretch>
                             <a:fillRect/>
                           </a:stretch>
@@ -2468,7 +2617,7 @@
                 <w:color w:val="9090A0"/>
                 <w:sz w:val="24"/>
               </w:rPr>
-              <w:t>17 / 19</w:t>
+              <w:t>18 / 20</w:t>
             </w:r>
           </w:p>
           <w:p>
@@ -2546,8 +2695,8 @@
             <w:r>
               <w:drawing>
                 <wp:inline xmlns:a="http://schemas.openxmlformats.org/drawingml/2006/main" xmlns:pic="http://schemas.openxmlformats.org/drawingml/2006/picture">
-                  <wp:extent cx="4320000" cy="3089620"/>
-                  <wp:docPr id="17" name="Picture 17"/>
+                  <wp:extent cx="4320000" cy="2424304"/>
+                  <wp:docPr id="18" name="Picture 18"/>
                   <wp:cNvGraphicFramePr>
                     <a:graphicFrameLocks noChangeAspect="1"/>
                   </wp:cNvGraphicFramePr>
@@ -2559,7 +2708,7 @@
                           <pic:cNvPicPr/>
                         </pic:nvPicPr>
                         <pic:blipFill>
-                          <a:blip r:embed="rId25"/>
+                          <a:blip r:embed="rId26"/>
                           <a:stretch>
                             <a:fillRect/>
                           </a:stretch>
@@ -2567,7 +2716,7 @@
                         <pic:spPr>
                           <a:xfrm>
                             <a:off x="0" y="0"/>
-                            <a:ext cx="4320000" cy="3089620"/>
+                            <a:ext cx="4320000" cy="2424304"/>
                           </a:xfrm>
                           <a:prstGeom prst="rect"/>
                         </pic:spPr>
@@ -2617,7 +2766,7 @@
                 <w:color w:val="9090A0"/>
                 <w:sz w:val="24"/>
               </w:rPr>
-              <w:t>18 / 19</w:t>
+              <w:t>19 / 20</w:t>
             </w:r>
           </w:p>
           <w:p>
@@ -2696,7 +2845,7 @@
               <w:drawing>
                 <wp:inline xmlns:a="http://schemas.openxmlformats.org/drawingml/2006/main" xmlns:pic="http://schemas.openxmlformats.org/drawingml/2006/picture">
                   <wp:extent cx="4320000" cy="3773165"/>
-                  <wp:docPr id="18" name="Picture 18"/>
+                  <wp:docPr id="19" name="Picture 19"/>
                   <wp:cNvGraphicFramePr>
                     <a:graphicFrameLocks noChangeAspect="1"/>
                   </wp:cNvGraphicFramePr>
@@ -2708,7 +2857,7 @@
                           <pic:cNvPicPr/>
                         </pic:nvPicPr>
                         <pic:blipFill>
-                          <a:blip r:embed="rId26"/>
+                          <a:blip r:embed="rId27"/>
                           <a:stretch>
                             <a:fillRect/>
                           </a:stretch>
@@ -2766,7 +2915,7 @@
                 <w:color w:val="9090A0"/>
                 <w:sz w:val="24"/>
               </w:rPr>
-              <w:t>19 / 19</w:t>
+              <w:t>20 / 20</w:t>
             </w:r>
           </w:p>
           <w:p>
@@ -2845,7 +2994,7 @@
               <w:drawing>
                 <wp:inline xmlns:a="http://schemas.openxmlformats.org/drawingml/2006/main" xmlns:pic="http://schemas.openxmlformats.org/drawingml/2006/picture">
                   <wp:extent cx="4320000" cy="4320000"/>
-                  <wp:docPr id="19" name="Picture 19"/>
+                  <wp:docPr id="20" name="Picture 20"/>
                   <wp:cNvGraphicFramePr>
                     <a:graphicFrameLocks noChangeAspect="1"/>
                   </wp:cNvGraphicFramePr>
@@ -2857,7 +3006,7 @@
                           <pic:cNvPicPr/>
                         </pic:nvPicPr>
                         <pic:blipFill>
-                          <a:blip r:embed="rId27"/>
+                          <a:blip r:embed="rId28"/>
                           <a:stretch>
                             <a:fillRect/>
                           </a:stretch>

</xml_diff>